<commit_message>
Add Key Achievements section for highlight-tagged achievements
Master Achievements tagged `highlight` (patents, awards, promotions,
launch results) now go into a `highlights` list on every Tailored
Resume, whatever the job. The validator rejects a tailored resume that
leaves one out, and the default template renders them as KEY
ACHIEVEMENTS between Summary and Skills.

Co-Authored-By: Claude Opus 5.5 <noreply@anthropic.com>
</commit_message>
<xml_diff>
--- a/templates/default.docx
+++ b/templates/default.docx
@@ -82,6 +82,90 @@
           <w:sz w:val="21"/>
         </w:rPr>
         <w:t>{{ summary }}</w:t>
+      </w:r>
+    </w:p>
+    <w:p>
+      <w:pPr>
+        <w:spacing w:before="0" w:after="0"/>
+        <w:jc w:val="left"/>
+      </w:pPr>
+      <w:r>
+        <w:rPr>
+          <w:b w:val="0"/>
+          <w:sz w:val="21"/>
+        </w:rPr>
+        <w:t>{%p endif %}</w:t>
+      </w:r>
+    </w:p>
+    <w:p>
+      <w:pPr>
+        <w:spacing w:before="0" w:after="0"/>
+        <w:jc w:val="left"/>
+      </w:pPr>
+      <w:r>
+        <w:rPr>
+          <w:b w:val="0"/>
+          <w:sz w:val="21"/>
+        </w:rPr>
+        <w:t>{%p if highlights %}</w:t>
+      </w:r>
+    </w:p>
+    <w:p>
+      <w:pPr>
+        <w:keepNext/>
+        <w:pBdr>
+          <w:bottom w:val="single" w:sz="6" w:space="1" w:color="000000"/>
+        </w:pBdr>
+        <w:spacing w:before="200" w:after="60"/>
+        <w:jc w:val="left"/>
+      </w:pPr>
+      <w:r>
+        <w:rPr>
+          <w:b/>
+          <w:sz w:val="23"/>
+        </w:rPr>
+        <w:t>KEY ACHIEVEMENTS</w:t>
+      </w:r>
+    </w:p>
+    <w:p>
+      <w:pPr>
+        <w:spacing w:before="0" w:after="0"/>
+        <w:jc w:val="left"/>
+      </w:pPr>
+      <w:r>
+        <w:rPr>
+          <w:b w:val="0"/>
+          <w:sz w:val="21"/>
+        </w:rPr>
+        <w:t>{%p for h in highlights %}</w:t>
+      </w:r>
+    </w:p>
+    <w:p>
+      <w:pPr>
+        <w:pStyle w:val="ListBullet"/>
+        <w:spacing w:before="0" w:after="20"/>
+        <w:ind w:left="340" w:hanging="227"/>
+        <w:jc w:val="left"/>
+      </w:pPr>
+      <w:r>
+        <w:rPr>
+          <w:b w:val="0"/>
+          <w:sz w:val="21"/>
+        </w:rPr>
+        <w:t>{{ h }}</w:t>
+      </w:r>
+    </w:p>
+    <w:p>
+      <w:pPr>
+        <w:spacing w:before="0" w:after="0"/>
+        <w:jc w:val="left"/>
+      </w:pPr>
+      <w:r>
+        <w:rPr>
+          <w:b w:val="0"/>
+          <w:sz w:val="21"/>
+        </w:rPr>
+        <w:t>{%p endfor %}</w:t>
       </w:r>
     </w:p>
     <w:p>

</xml_diff>

<commit_message>
Add Work Areas: group an experience entry's Achievements, require core areas
A master experience entry can define `areas`, named groups of its own
Achievements (e.g. capture engine, Smart Meeting Flow). A `core` area is
the main body of work in that job and must appear in every Tailored
Resume, so tailoring for a different field no longer hides it.

- Validator: area members exist in the entry, belong to one area, are
  not `highlight`; area quotes are checked like Achievement quotes. A
  tailored area keeps the master name/summary, holds only its members,
  and every core area (and its entry) is present.
- Renderer and default template: area name in bold with an optional
  summary, its bullets below, ungrouped bullets after. render_master.py
  shows areas in master.md.
- /scan files new Achievements into areas; /tailor selects core areas.

Co-Authored-By: Claude Opus 5.5 <noreply@anthropic.com>
</commit_message>
<xml_diff>
--- a/templates/default.docx
+++ b/templates/default.docx
@@ -339,6 +339,94 @@
           <w:sz w:val="21"/>
         </w:rPr>
         <w:t>{{ job.title }}</w:t>
+      </w:r>
+    </w:p>
+    <w:p>
+      <w:pPr>
+        <w:spacing w:before="0" w:after="0"/>
+        <w:jc w:val="left"/>
+      </w:pPr>
+      <w:r>
+        <w:rPr>
+          <w:b w:val="0"/>
+          <w:sz w:val="21"/>
+        </w:rPr>
+        <w:t>{%p for a in job.areas %}</w:t>
+      </w:r>
+    </w:p>
+    <w:p>
+      <w:pPr>
+        <w:tabs>
+          <w:tab w:pos="9638" w:val="right"/>
+        </w:tabs>
+        <w:spacing w:before="40" w:after="0"/>
+        <w:jc w:val="left"/>
+      </w:pPr>
+      <w:r>
+        <w:rPr>
+          <w:b/>
+        </w:rPr>
+        <w:t>{{ a.name }}</w:t>
+      </w:r>
+      <w:r>
+        <w:rPr>
+          <w:b w:val="0"/>
+        </w:rPr>
+        <w:t>{{ a.summary_suffix }}</w:t>
+      </w:r>
+    </w:p>
+    <w:p>
+      <w:pPr>
+        <w:spacing w:before="0" w:after="0"/>
+        <w:jc w:val="left"/>
+      </w:pPr>
+      <w:r>
+        <w:rPr>
+          <w:b w:val="0"/>
+          <w:sz w:val="21"/>
+        </w:rPr>
+        <w:t>{%p for b in a.bullets %}</w:t>
+      </w:r>
+    </w:p>
+    <w:p>
+      <w:pPr>
+        <w:pStyle w:val="ListBullet"/>
+        <w:spacing w:before="0" w:after="20"/>
+        <w:ind w:left="340" w:hanging="227"/>
+        <w:jc w:val="left"/>
+      </w:pPr>
+      <w:r>
+        <w:rPr>
+          <w:b w:val="0"/>
+          <w:sz w:val="21"/>
+        </w:rPr>
+        <w:t>{{ b }}</w:t>
+      </w:r>
+    </w:p>
+    <w:p>
+      <w:pPr>
+        <w:spacing w:before="0" w:after="0"/>
+        <w:jc w:val="left"/>
+      </w:pPr>
+      <w:r>
+        <w:rPr>
+          <w:b w:val="0"/>
+          <w:sz w:val="21"/>
+        </w:rPr>
+        <w:t>{%p endfor %}</w:t>
+      </w:r>
+    </w:p>
+    <w:p>
+      <w:pPr>
+        <w:spacing w:before="0" w:after="0"/>
+        <w:jc w:val="left"/>
+      </w:pPr>
+      <w:r>
+        <w:rPr>
+          <w:b w:val="0"/>
+          <w:sz w:val="21"/>
+        </w:rPr>
+        <w:t>{%p endfor %}</w:t>
       </w:r>
     </w:p>
     <w:p>

</xml_diff>

<commit_message>
Add optional thesis to education entries
Master and tailored education entries accept `thesis`. The default
template prints it in italics under the degree ("Thesis: ..."), only
when set, and render_master.py lists it in master.md.

Co-Authored-By: Claude Opus 5.5 <noreply@anthropic.com>
</commit_message>
<xml_diff>
--- a/templates/default.docx
+++ b/templates/default.docx
@@ -568,6 +568,46 @@
           <w:b w:val="0"/>
           <w:sz w:val="21"/>
         </w:rPr>
+        <w:t>{%p if e.thesis %}</w:t>
+      </w:r>
+    </w:p>
+    <w:p>
+      <w:pPr>
+        <w:spacing w:before="0" w:after="0"/>
+        <w:jc w:val="left"/>
+      </w:pPr>
+      <w:r>
+        <w:rPr>
+          <w:b w:val="0"/>
+          <w:i/>
+          <w:sz w:val="21"/>
+        </w:rPr>
+        <w:t>Thesis: {{ e.thesis }}</w:t>
+      </w:r>
+    </w:p>
+    <w:p>
+      <w:pPr>
+        <w:spacing w:before="0" w:after="0"/>
+        <w:jc w:val="left"/>
+      </w:pPr>
+      <w:r>
+        <w:rPr>
+          <w:b w:val="0"/>
+          <w:sz w:val="21"/>
+        </w:rPr>
+        <w:t>{%p endif %}</w:t>
+      </w:r>
+    </w:p>
+    <w:p>
+      <w:pPr>
+        <w:spacing w:before="0" w:after="0"/>
+        <w:jc w:val="left"/>
+      </w:pPr>
+      <w:r>
+        <w:rPr>
+          <w:b w:val="0"/>
+          <w:sz w:val="21"/>
+        </w:rPr>
         <w:t>{%p endfor %}</w:t>
       </w:r>
     </w:p>

</xml_diff>